<commit_message>
Adding Phase-5 code changes which handles 4 tools
</commit_message>
<xml_diff>
--- a/docs/Deposits.docx
+++ b/docs/Deposits.docx
@@ -58,7 +58,7 @@
     <w:p>
       <w:r>
         <w:pict w14:anchorId="783B67DE">
-          <v:rect id="_x0000_i1067" style="width:0;height:1.5pt" o:hralign="center" o:hrstd="t" o:hr="t" fillcolor="#a0a0a0" stroked="f"/>
+          <v:rect id="_x0000_i1025" style="width:0;height:1.5pt" o:hralign="center" o:hrstd="t" o:hr="t" fillcolor="#a0a0a0" stroked="f"/>
         </w:pict>
       </w:r>
     </w:p>
@@ -671,7 +671,7 @@
     <w:p>
       <w:r>
         <w:pict w14:anchorId="1A0C94BB">
-          <v:rect id="_x0000_i1068" style="width:0;height:1.5pt" o:hralign="center" o:hrstd="t" o:hr="t" fillcolor="#a0a0a0" stroked="f"/>
+          <v:rect id="_x0000_i1026" style="width:0;height:1.5pt" o:hralign="center" o:hrstd="t" o:hr="t" fillcolor="#a0a0a0" stroked="f"/>
         </w:pict>
       </w:r>
     </w:p>
@@ -962,7 +962,7 @@
     <w:p>
       <w:r>
         <w:pict w14:anchorId="6FB27EC1">
-          <v:rect id="_x0000_i1069" style="width:0;height:1.5pt" o:hralign="center" o:hrstd="t" o:hr="t" fillcolor="#a0a0a0" stroked="f"/>
+          <v:rect id="_x0000_i1027" style="width:0;height:1.5pt" o:hralign="center" o:hrstd="t" o:hr="t" fillcolor="#a0a0a0" stroked="f"/>
         </w:pict>
       </w:r>
     </w:p>
@@ -1107,7 +1107,10 @@
           </w:tcPr>
           <w:p>
             <w:r>
-              <w:t>3.50%</w:t>
+              <w:t>10</w:t>
+            </w:r>
+            <w:r>
+              <w:t>.50%</w:t>
             </w:r>
           </w:p>
         </w:tc>
@@ -1148,7 +1151,13 @@
           </w:tcPr>
           <w:p>
             <w:r>
-              <w:t>5.00%</w:t>
+              <w:t>1</w:t>
+            </w:r>
+            <w:r>
+              <w:t>0</w:t>
+            </w:r>
+            <w:r>
+              <w:t>.00%</w:t>
             </w:r>
           </w:p>
         </w:tc>
@@ -1189,7 +1198,10 @@
           </w:tcPr>
           <w:p>
             <w:r>
-              <w:t>6.25%</w:t>
+              <w:t>6</w:t>
+            </w:r>
+            <w:r>
+              <w:t>.25%</w:t>
             </w:r>
           </w:p>
         </w:tc>
@@ -1271,7 +1283,10 @@
           </w:tcPr>
           <w:p>
             <w:r>
-              <w:t>7.00%</w:t>
+              <w:t>12</w:t>
+            </w:r>
+            <w:r>
+              <w:t>.00%</w:t>
             </w:r>
           </w:p>
         </w:tc>
@@ -1312,7 +1327,10 @@
           </w:tcPr>
           <w:p>
             <w:r>
-              <w:t>6.75%</w:t>
+              <w:t>12</w:t>
+            </w:r>
+            <w:r>
+              <w:t>.75%</w:t>
             </w:r>
           </w:p>
         </w:tc>
@@ -1321,7 +1339,7 @@
     <w:p>
       <w:r>
         <w:pict w14:anchorId="2DB5B47D">
-          <v:rect id="_x0000_i1070" style="width:0;height:1.5pt" o:hralign="center" o:hrstd="t" o:hr="t" fillcolor="#a0a0a0" stroked="f"/>
+          <v:rect id="_x0000_i1028" style="width:0;height:1.5pt" o:hralign="center" o:hrstd="t" o:hr="t" fillcolor="#a0a0a0" stroked="f"/>
         </w:pict>
       </w:r>
     </w:p>
@@ -1497,7 +1515,7 @@
     <w:p>
       <w:r>
         <w:pict w14:anchorId="2ED9FB59">
-          <v:rect id="_x0000_i1071" style="width:0;height:1.5pt" o:hralign="center" o:hrstd="t" o:hr="t" fillcolor="#a0a0a0" stroked="f"/>
+          <v:rect id="_x0000_i1029" style="width:0;height:1.5pt" o:hralign="center" o:hrstd="t" o:hr="t" fillcolor="#a0a0a0" stroked="f"/>
         </w:pict>
       </w:r>
     </w:p>
@@ -1732,7 +1750,7 @@
     <w:p>
       <w:r>
         <w:pict w14:anchorId="7B8C5A4C">
-          <v:rect id="_x0000_i1072" style="width:0;height:1.5pt" o:hralign="center" o:hrstd="t" o:hr="t" fillcolor="#a0a0a0" stroked="f"/>
+          <v:rect id="_x0000_i1030" style="width:0;height:1.5pt" o:hralign="center" o:hrstd="t" o:hr="t" fillcolor="#a0a0a0" stroked="f"/>
         </w:pict>
       </w:r>
     </w:p>
@@ -1966,7 +1984,7 @@
     <w:p>
       <w:r>
         <w:pict w14:anchorId="52711510">
-          <v:rect id="_x0000_i1073" style="width:0;height:1.5pt" o:hralign="center" o:hrstd="t" o:hr="t" fillcolor="#a0a0a0" stroked="f"/>
+          <v:rect id="_x0000_i1031" style="width:0;height:1.5pt" o:hralign="center" o:hrstd="t" o:hr="t" fillcolor="#a0a0a0" stroked="f"/>
         </w:pict>
       </w:r>
     </w:p>
@@ -2854,6 +2872,7 @@
   <w:style w:type="character" w:default="1" w:styleId="DefaultParagraphFont">
     <w:name w:val="Default Paragraph Font"/>
     <w:uiPriority w:val="1"/>
+    <w:semiHidden/>
     <w:unhideWhenUsed/>
   </w:style>
   <w:style w:type="table" w:default="1" w:styleId="TableNormal">

</xml_diff>